<commit_message>
Fix renaming logic, RLS policy updates, and Word export table layout
</commit_message>
<xml_diff>
--- a/reference.docx
+++ b/reference.docx
@@ -5,46 +5,26 @@
     <w:tbl>
       <w:tblPr>
         <w:tblStyle w:val="TableGrid"/>
+        <w:tblpPr w:leftFromText="180" w:rightFromText="180" w:vertAnchor="text" w:horzAnchor="margin" w:tblpY="9569"/>
         <w:tblW w:w="0" w:type="auto"/>
-        <w:tblLook w:val="01E0" w:firstRow="1" w:lastRow="1" w:firstColumn="1" w:lastColumn="1" w:noHBand="0" w:noVBand="0"/>
+        <w:tblLook w:val="04A0" w:firstRow="1" w:lastRow="0" w:firstColumn="1" w:lastColumn="0" w:noHBand="0" w:noVBand="1"/>
       </w:tblPr>
       <w:tblGrid>
-        <w:gridCol w:w="4788"/>
-        <w:gridCol w:w="4788"/>
+        <w:gridCol w:w="9576"/>
       </w:tblGrid>
       <w:tr>
         <w:tc>
           <w:tcPr>
-            <w:tcW w:w="4788" w:type="dxa"/>
-          </w:tcPr>
-          <w:p>
-            <w:bookmarkStart w:id="0" w:name="_GoBack"/>
-            <w:bookmarkEnd w:id="0"/>
-          </w:p>
-        </w:tc>
-        <w:tc>
-          <w:tcPr>
-            <w:tcW w:w="4788" w:type="dxa"/>
-          </w:tcPr>
-          <w:p/>
-        </w:tc>
-      </w:tr>
-      <w:tr>
-        <w:tc>
-          <w:tcPr>
-            <w:tcW w:w="4788" w:type="dxa"/>
-          </w:tcPr>
-          <w:p/>
-        </w:tc>
-        <w:tc>
-          <w:tcPr>
-            <w:tcW w:w="4788" w:type="dxa"/>
+            <w:tcW w:w="9576" w:type="dxa"/>
           </w:tcPr>
           <w:p/>
         </w:tc>
       </w:tr>
     </w:tbl>
-    <w:p/>
+    <w:p>
+      <w:bookmarkStart w:id="0" w:name="_GoBack"/>
+      <w:bookmarkEnd w:id="0"/>
+    </w:p>
     <w:sectPr>
       <w:pgSz w:w="12240" w:h="15840"/>
       <w:pgMar w:top="1701" w:right="1440" w:bottom="1440" w:left="1440" w:header="708" w:footer="708" w:gutter="0"/>
@@ -777,7 +757,7 @@
 </file>
 
 <file path=customXml/itemProps1.xml><?xml version="1.0" encoding="utf-8"?>
-<ds:datastoreItem xmlns:ds="http://schemas.openxmlformats.org/officeDocument/2006/customXml" ds:itemID="{2B1137AE-175F-4856-87A8-27761F05E558}">
+<ds:datastoreItem xmlns:ds="http://schemas.openxmlformats.org/officeDocument/2006/customXml" ds:itemID="{9A70435E-AC3F-4EDA-9FDC-0A30E6686875}">
   <ds:schemaRefs>
     <ds:schemaRef ds:uri="http://schemas.openxmlformats.org/officeDocument/2006/bibliography"/>
   </ds:schemaRefs>

</xml_diff>